<commit_message>
Luckily dark mode excel and word made things easier
</commit_message>
<xml_diff>
--- a/PEX3_Report_Template.docx
+++ b/PEX3_Report_Template.docx
@@ -24,7 +24,22 @@
       </w:r>
       <w:r>
         <w:br/>
-        <w:t>Name: ________________________     Section: ________     Date: ____________</w:t>
+        <w:t xml:space="preserve">Name: </w:t>
+      </w:r>
+      <w:r>
+        <w:t>Peter Ye</w:t>
+      </w:r>
+      <w:r>
+        <w:t xml:space="preserve">     Section: </w:t>
+      </w:r>
+      <w:r>
+        <w:t>M3</w:t>
+      </w:r>
+      <w:r>
+        <w:t xml:space="preserve">     Date: </w:t>
+      </w:r>
+      <w:r>
+        <w:t>23 April</w:t>
       </w:r>
     </w:p>
     <w:p>
@@ -37,7 +52,7 @@
     </w:p>
     <w:p>
       <w:r>
-        <w:t>[Replace this text with your documentation statement per the course syllabus. List all help received, references consulted, and AI tools used. A documentation statement is also required in main.c. Missing documentation from either location results in a 5% (4 pt) deduction.]</w:t>
+        <w:t>I received no outside help on the report portion of this assignment.</w:t>
       </w:r>
     </w:p>
     <w:p>
@@ -50,7 +65,7 @@
     </w:p>
     <w:p>
       <w:r>
-        <w:t>[State which frame size and how many frames you recommend to keep the page-fault rate below 10%. Justify your recommendation using your simulation data. Consider both memory overhead and fault-rate performance.]</w:t>
+        <w:t xml:space="preserve">The best choice would be to use the 1KB frame size with 318 frames. This is since the page fault rate is below 10% while also being most efficient in memory use compared to the other frame to memory ratios. </w:t>
       </w:r>
     </w:p>
     <w:p>
@@ -74,9 +89,9 @@
         <w:tblLook w:val="04A0" w:firstRow="1" w:lastRow="0" w:firstColumn="1" w:lastColumn="0" w:noHBand="0" w:noVBand="1"/>
       </w:tblPr>
       <w:tblGrid>
-        <w:gridCol w:w="2880"/>
-        <w:gridCol w:w="2880"/>
-        <w:gridCol w:w="2880"/>
+        <w:gridCol w:w="2873"/>
+        <w:gridCol w:w="2873"/>
+        <w:gridCol w:w="2874"/>
       </w:tblGrid>
       <w:tr>
         <w:trPr>
@@ -145,6 +160,9 @@
             <w:pPr>
               <w:cnfStyle w:val="000000100000" w:firstRow="0" w:lastRow="0" w:firstColumn="0" w:lastColumn="0" w:oddVBand="0" w:evenVBand="0" w:oddHBand="1" w:evenHBand="0" w:firstRowFirstColumn="0" w:firstRowLastColumn="0" w:lastRowFirstColumn="0" w:lastRowLastColumn="0"/>
             </w:pPr>
+            <w:r>
+              <w:t>689</w:t>
+            </w:r>
           </w:p>
         </w:tc>
         <w:tc>
@@ -155,6 +173,9 @@
             <w:pPr>
               <w:cnfStyle w:val="000000100000" w:firstRow="0" w:lastRow="0" w:firstColumn="0" w:lastColumn="0" w:oddVBand="0" w:evenVBand="0" w:oddHBand="1" w:evenHBand="0" w:firstRowFirstColumn="0" w:firstRowLastColumn="0" w:lastRowFirstColumn="0" w:lastRowLastColumn="0"/>
             </w:pPr>
+            <w:r>
+              <w:t>9.9996%</w:t>
+            </w:r>
           </w:p>
         </w:tc>
       </w:tr>
@@ -182,6 +203,9 @@
             <w:pPr>
               <w:cnfStyle w:val="000000010000" w:firstRow="0" w:lastRow="0" w:firstColumn="0" w:lastColumn="0" w:oddVBand="0" w:evenVBand="0" w:oddHBand="0" w:evenHBand="1" w:firstRowFirstColumn="0" w:firstRowLastColumn="0" w:lastRowFirstColumn="0" w:lastRowLastColumn="0"/>
             </w:pPr>
+            <w:r>
+              <w:t>318</w:t>
+            </w:r>
           </w:p>
         </w:tc>
         <w:tc>
@@ -192,6 +216,9 @@
             <w:pPr>
               <w:cnfStyle w:val="000000010000" w:firstRow="0" w:lastRow="0" w:firstColumn="0" w:lastColumn="0" w:oddVBand="0" w:evenVBand="0" w:oddHBand="0" w:evenHBand="1" w:firstRowFirstColumn="0" w:firstRowLastColumn="0" w:lastRowFirstColumn="0" w:lastRowLastColumn="0"/>
             </w:pPr>
+            <w:r>
+              <w:t>9.9937%</w:t>
+            </w:r>
           </w:p>
         </w:tc>
       </w:tr>
@@ -219,6 +246,9 @@
             <w:pPr>
               <w:cnfStyle w:val="000000100000" w:firstRow="0" w:lastRow="0" w:firstColumn="0" w:lastColumn="0" w:oddVBand="0" w:evenVBand="0" w:oddHBand="1" w:evenHBand="0" w:firstRowFirstColumn="0" w:firstRowLastColumn="0" w:lastRowFirstColumn="0" w:lastRowLastColumn="0"/>
             </w:pPr>
+            <w:r>
+              <w:t>179</w:t>
+            </w:r>
           </w:p>
         </w:tc>
         <w:tc>
@@ -229,6 +259,9 @@
             <w:pPr>
               <w:cnfStyle w:val="000000100000" w:firstRow="0" w:lastRow="0" w:firstColumn="0" w:lastColumn="0" w:oddVBand="0" w:evenVBand="0" w:oddHBand="1" w:evenHBand="0" w:firstRowFirstColumn="0" w:firstRowLastColumn="0" w:lastRowFirstColumn="0" w:lastRowLastColumn="0"/>
             </w:pPr>
+            <w:r>
+              <w:t>9.9777%</w:t>
+            </w:r>
           </w:p>
         </w:tc>
       </w:tr>
@@ -256,6 +289,9 @@
             <w:pPr>
               <w:cnfStyle w:val="000000010000" w:firstRow="0" w:lastRow="0" w:firstColumn="0" w:lastColumn="0" w:oddVBand="0" w:evenVBand="0" w:oddHBand="0" w:evenHBand="1" w:firstRowFirstColumn="0" w:firstRowLastColumn="0" w:lastRowFirstColumn="0" w:lastRowLastColumn="0"/>
             </w:pPr>
+            <w:r>
+              <w:t>106</w:t>
+            </w:r>
           </w:p>
         </w:tc>
         <w:tc>
@@ -266,6 +302,9 @@
             <w:pPr>
               <w:cnfStyle w:val="000000010000" w:firstRow="0" w:lastRow="0" w:firstColumn="0" w:lastColumn="0" w:oddVBand="0" w:evenVBand="0" w:oddHBand="0" w:evenHBand="1" w:firstRowFirstColumn="0" w:firstRowLastColumn="0" w:lastRowFirstColumn="0" w:lastRowLastColumn="0"/>
             </w:pPr>
+            <w:r>
+              <w:t>9.9938%</w:t>
+            </w:r>
           </w:p>
         </w:tc>
       </w:tr>
@@ -304,13 +343,56 @@
         <w:t>[Insert 512 B Page Faults chart here]</w:t>
       </w:r>
     </w:p>
-    <w:p/>
+    <w:p>
+      <w:r>
+        <w:rPr>
+          <w:noProof/>
+        </w:rPr>
+        <w:lastRenderedPageBreak/>
+        <w:drawing>
+          <wp:inline distT="0" distB="0" distL="0" distR="0" wp14:anchorId="3D17B03A" wp14:editId="1FD9AEB9">
+            <wp:extent cx="5486400" cy="3035300"/>
+            <wp:effectExtent l="0" t="0" r="0" b="0"/>
+            <wp:docPr id="1" name="Picture 1"/>
+            <wp:cNvGraphicFramePr>
+              <a:graphicFrameLocks xmlns:a="http://schemas.openxmlformats.org/drawingml/2006/main" noChangeAspect="1"/>
+            </wp:cNvGraphicFramePr>
+            <a:graphic xmlns:a="http://schemas.openxmlformats.org/drawingml/2006/main">
+              <a:graphicData uri="http://schemas.openxmlformats.org/drawingml/2006/picture">
+                <pic:pic xmlns:pic="http://schemas.openxmlformats.org/drawingml/2006/picture">
+                  <pic:nvPicPr>
+                    <pic:cNvPr id="1" name="Picture 1"/>
+                    <pic:cNvPicPr>
+                      <a:picLocks noChangeAspect="1"/>
+                    </pic:cNvPicPr>
+                  </pic:nvPicPr>
+                  <pic:blipFill>
+                    <a:blip r:embed="rId9"/>
+                    <a:stretch>
+                      <a:fillRect/>
+                    </a:stretch>
+                  </pic:blipFill>
+                  <pic:spPr>
+                    <a:xfrm>
+                      <a:off x="0" y="0"/>
+                      <a:ext cx="5486400" cy="3035300"/>
+                    </a:xfrm>
+                    <a:prstGeom prst="rect">
+                      <a:avLst/>
+                    </a:prstGeom>
+                  </pic:spPr>
+                </pic:pic>
+              </a:graphicData>
+            </a:graphic>
+          </wp:inline>
+        </w:drawing>
+      </w:r>
+    </w:p>
     <w:p>
       <w:pPr>
         <w:pStyle w:val="Heading3"/>
       </w:pPr>
       <w:r>
-        <w:lastRenderedPageBreak/>
         <w:t>1 KB Frames — Page Faults (1.5 pts)</w:t>
       </w:r>
     </w:p>
@@ -326,7 +408,50 @@
         <w:t>[Insert 1 KB Page Faults chart here]</w:t>
       </w:r>
     </w:p>
-    <w:p/>
+    <w:p>
+      <w:r>
+        <w:rPr>
+          <w:noProof/>
+        </w:rPr>
+        <w:drawing>
+          <wp:inline distT="0" distB="0" distL="0" distR="0" wp14:anchorId="20074F76" wp14:editId="348FC493">
+            <wp:extent cx="5486400" cy="3035300"/>
+            <wp:effectExtent l="0" t="0" r="0" b="0"/>
+            <wp:docPr id="2" name="Picture 1"/>
+            <wp:cNvGraphicFramePr>
+              <a:graphicFrameLocks xmlns:a="http://schemas.openxmlformats.org/drawingml/2006/main" noChangeAspect="1"/>
+            </wp:cNvGraphicFramePr>
+            <a:graphic xmlns:a="http://schemas.openxmlformats.org/drawingml/2006/main">
+              <a:graphicData uri="http://schemas.openxmlformats.org/drawingml/2006/picture">
+                <pic:pic xmlns:pic="http://schemas.openxmlformats.org/drawingml/2006/picture">
+                  <pic:nvPicPr>
+                    <pic:cNvPr id="2" name="Picture 2"/>
+                    <pic:cNvPicPr>
+                      <a:picLocks noChangeAspect="1"/>
+                    </pic:cNvPicPr>
+                  </pic:nvPicPr>
+                  <pic:blipFill>
+                    <a:blip r:embed="rId10"/>
+                    <a:stretch>
+                      <a:fillRect/>
+                    </a:stretch>
+                  </pic:blipFill>
+                  <pic:spPr>
+                    <a:xfrm>
+                      <a:off x="0" y="0"/>
+                      <a:ext cx="5486400" cy="3035300"/>
+                    </a:xfrm>
+                    <a:prstGeom prst="rect">
+                      <a:avLst/>
+                    </a:prstGeom>
+                  </pic:spPr>
+                </pic:pic>
+              </a:graphicData>
+            </a:graphic>
+          </wp:inline>
+        </w:drawing>
+      </w:r>
+    </w:p>
     <w:p>
       <w:pPr>
         <w:pStyle w:val="Heading3"/>
@@ -347,7 +472,51 @@
         <w:t>[Insert 2 KB Page Faults chart here]</w:t>
       </w:r>
     </w:p>
-    <w:p/>
+    <w:p>
+      <w:r>
+        <w:rPr>
+          <w:noProof/>
+        </w:rPr>
+        <w:lastRenderedPageBreak/>
+        <w:drawing>
+          <wp:inline distT="0" distB="0" distL="0" distR="0" wp14:anchorId="7BC594E0" wp14:editId="158D4E2E">
+            <wp:extent cx="5486400" cy="3035300"/>
+            <wp:effectExtent l="0" t="0" r="0" b="0"/>
+            <wp:docPr id="3" name="Picture 1"/>
+            <wp:cNvGraphicFramePr>
+              <a:graphicFrameLocks xmlns:a="http://schemas.openxmlformats.org/drawingml/2006/main" noChangeAspect="1"/>
+            </wp:cNvGraphicFramePr>
+            <a:graphic xmlns:a="http://schemas.openxmlformats.org/drawingml/2006/main">
+              <a:graphicData uri="http://schemas.openxmlformats.org/drawingml/2006/picture">
+                <pic:pic xmlns:pic="http://schemas.openxmlformats.org/drawingml/2006/picture">
+                  <pic:nvPicPr>
+                    <pic:cNvPr id="3" name="Picture 3"/>
+                    <pic:cNvPicPr>
+                      <a:picLocks noChangeAspect="1"/>
+                    </pic:cNvPicPr>
+                  </pic:nvPicPr>
+                  <pic:blipFill>
+                    <a:blip r:embed="rId11"/>
+                    <a:stretch>
+                      <a:fillRect/>
+                    </a:stretch>
+                  </pic:blipFill>
+                  <pic:spPr>
+                    <a:xfrm>
+                      <a:off x="0" y="0"/>
+                      <a:ext cx="5486400" cy="3035300"/>
+                    </a:xfrm>
+                    <a:prstGeom prst="rect">
+                      <a:avLst/>
+                    </a:prstGeom>
+                  </pic:spPr>
+                </pic:pic>
+              </a:graphicData>
+            </a:graphic>
+          </wp:inline>
+        </w:drawing>
+      </w:r>
+    </w:p>
     <w:p>
       <w:pPr>
         <w:pStyle w:val="Heading3"/>
@@ -368,7 +537,50 @@
         <w:t>[Insert 4 KB Page Faults chart here]</w:t>
       </w:r>
     </w:p>
-    <w:p/>
+    <w:p>
+      <w:r>
+        <w:rPr>
+          <w:noProof/>
+        </w:rPr>
+        <w:drawing>
+          <wp:inline distT="0" distB="0" distL="0" distR="0" wp14:anchorId="58C318A7" wp14:editId="737AB765">
+            <wp:extent cx="5486400" cy="3035300"/>
+            <wp:effectExtent l="0" t="0" r="0" b="0"/>
+            <wp:docPr id="4" name="Picture 1"/>
+            <wp:cNvGraphicFramePr>
+              <a:graphicFrameLocks xmlns:a="http://schemas.openxmlformats.org/drawingml/2006/main" noChangeAspect="1"/>
+            </wp:cNvGraphicFramePr>
+            <a:graphic xmlns:a="http://schemas.openxmlformats.org/drawingml/2006/main">
+              <a:graphicData uri="http://schemas.openxmlformats.org/drawingml/2006/picture">
+                <pic:pic xmlns:pic="http://schemas.openxmlformats.org/drawingml/2006/picture">
+                  <pic:nvPicPr>
+                    <pic:cNvPr id="4" name="Picture 4"/>
+                    <pic:cNvPicPr>
+                      <a:picLocks noChangeAspect="1"/>
+                    </pic:cNvPicPr>
+                  </pic:nvPicPr>
+                  <pic:blipFill>
+                    <a:blip r:embed="rId12"/>
+                    <a:stretch>
+                      <a:fillRect/>
+                    </a:stretch>
+                  </pic:blipFill>
+                  <pic:spPr>
+                    <a:xfrm>
+                      <a:off x="0" y="0"/>
+                      <a:ext cx="5486400" cy="3035300"/>
+                    </a:xfrm>
+                    <a:prstGeom prst="rect">
+                      <a:avLst/>
+                    </a:prstGeom>
+                  </pic:spPr>
+                </pic:pic>
+              </a:graphicData>
+            </a:graphic>
+          </wp:inline>
+        </w:drawing>
+      </w:r>
+    </w:p>
     <w:p>
       <w:pPr>
         <w:pStyle w:val="Heading1"/>
@@ -387,6 +599,7 @@
         <w:pStyle w:val="Heading3"/>
       </w:pPr>
       <w:r>
+        <w:lastRenderedPageBreak/>
         <w:t>512 B Frames — Fault Rate (1.5 pts)</w:t>
       </w:r>
     </w:p>
@@ -402,7 +615,50 @@
         <w:t>[Insert 512 B Fault Rate chart here — include 10% reference line]</w:t>
       </w:r>
     </w:p>
-    <w:p/>
+    <w:p>
+      <w:r>
+        <w:rPr>
+          <w:noProof/>
+        </w:rPr>
+        <w:drawing>
+          <wp:inline distT="0" distB="0" distL="0" distR="0" wp14:anchorId="146B6E59" wp14:editId="3E3BDCB5">
+            <wp:extent cx="5486400" cy="3038475"/>
+            <wp:effectExtent l="0" t="0" r="0" b="9525"/>
+            <wp:docPr id="5" name="Picture 1"/>
+            <wp:cNvGraphicFramePr>
+              <a:graphicFrameLocks xmlns:a="http://schemas.openxmlformats.org/drawingml/2006/main" noChangeAspect="1"/>
+            </wp:cNvGraphicFramePr>
+            <a:graphic xmlns:a="http://schemas.openxmlformats.org/drawingml/2006/main">
+              <a:graphicData uri="http://schemas.openxmlformats.org/drawingml/2006/picture">
+                <pic:pic xmlns:pic="http://schemas.openxmlformats.org/drawingml/2006/picture">
+                  <pic:nvPicPr>
+                    <pic:cNvPr id="5" name="Picture 5"/>
+                    <pic:cNvPicPr>
+                      <a:picLocks noChangeAspect="1"/>
+                    </pic:cNvPicPr>
+                  </pic:nvPicPr>
+                  <pic:blipFill>
+                    <a:blip r:embed="rId13"/>
+                    <a:stretch>
+                      <a:fillRect/>
+                    </a:stretch>
+                  </pic:blipFill>
+                  <pic:spPr>
+                    <a:xfrm>
+                      <a:off x="0" y="0"/>
+                      <a:ext cx="5486400" cy="3038475"/>
+                    </a:xfrm>
+                    <a:prstGeom prst="rect">
+                      <a:avLst/>
+                    </a:prstGeom>
+                  </pic:spPr>
+                </pic:pic>
+              </a:graphicData>
+            </a:graphic>
+          </wp:inline>
+        </w:drawing>
+      </w:r>
+    </w:p>
     <w:p>
       <w:pPr>
         <w:pStyle w:val="Heading3"/>
@@ -423,7 +679,50 @@
         <w:t>[Insert 1 KB Fault Rate chart here — include 10% reference line]</w:t>
       </w:r>
     </w:p>
-    <w:p/>
+    <w:p>
+      <w:r>
+        <w:rPr>
+          <w:noProof/>
+        </w:rPr>
+        <w:drawing>
+          <wp:inline distT="0" distB="0" distL="0" distR="0" wp14:anchorId="490F10CF" wp14:editId="12EEE110">
+            <wp:extent cx="5486400" cy="3038475"/>
+            <wp:effectExtent l="0" t="0" r="0" b="9525"/>
+            <wp:docPr id="6" name="Picture 1"/>
+            <wp:cNvGraphicFramePr>
+              <a:graphicFrameLocks xmlns:a="http://schemas.openxmlformats.org/drawingml/2006/main" noChangeAspect="1"/>
+            </wp:cNvGraphicFramePr>
+            <a:graphic xmlns:a="http://schemas.openxmlformats.org/drawingml/2006/main">
+              <a:graphicData uri="http://schemas.openxmlformats.org/drawingml/2006/picture">
+                <pic:pic xmlns:pic="http://schemas.openxmlformats.org/drawingml/2006/picture">
+                  <pic:nvPicPr>
+                    <pic:cNvPr id="6" name="Picture 6"/>
+                    <pic:cNvPicPr>
+                      <a:picLocks noChangeAspect="1"/>
+                    </pic:cNvPicPr>
+                  </pic:nvPicPr>
+                  <pic:blipFill>
+                    <a:blip r:embed="rId14"/>
+                    <a:stretch>
+                      <a:fillRect/>
+                    </a:stretch>
+                  </pic:blipFill>
+                  <pic:spPr>
+                    <a:xfrm>
+                      <a:off x="0" y="0"/>
+                      <a:ext cx="5486400" cy="3038475"/>
+                    </a:xfrm>
+                    <a:prstGeom prst="rect">
+                      <a:avLst/>
+                    </a:prstGeom>
+                  </pic:spPr>
+                </pic:pic>
+              </a:graphicData>
+            </a:graphic>
+          </wp:inline>
+        </w:drawing>
+      </w:r>
+    </w:p>
     <w:p>
       <w:pPr>
         <w:pStyle w:val="Heading3"/>
@@ -444,7 +743,51 @@
         <w:t>[Insert 2 KB Fault Rate chart here — include 10% reference line]</w:t>
       </w:r>
     </w:p>
-    <w:p/>
+    <w:p>
+      <w:r>
+        <w:rPr>
+          <w:noProof/>
+        </w:rPr>
+        <w:lastRenderedPageBreak/>
+        <w:drawing>
+          <wp:inline distT="0" distB="0" distL="0" distR="0" wp14:anchorId="78292AB5" wp14:editId="4097DD7D">
+            <wp:extent cx="5486400" cy="3038475"/>
+            <wp:effectExtent l="0" t="0" r="0" b="9525"/>
+            <wp:docPr id="7" name="Picture 1"/>
+            <wp:cNvGraphicFramePr>
+              <a:graphicFrameLocks xmlns:a="http://schemas.openxmlformats.org/drawingml/2006/main" noChangeAspect="1"/>
+            </wp:cNvGraphicFramePr>
+            <a:graphic xmlns:a="http://schemas.openxmlformats.org/drawingml/2006/main">
+              <a:graphicData uri="http://schemas.openxmlformats.org/drawingml/2006/picture">
+                <pic:pic xmlns:pic="http://schemas.openxmlformats.org/drawingml/2006/picture">
+                  <pic:nvPicPr>
+                    <pic:cNvPr id="7" name="Picture 7"/>
+                    <pic:cNvPicPr>
+                      <a:picLocks noChangeAspect="1"/>
+                    </pic:cNvPicPr>
+                  </pic:nvPicPr>
+                  <pic:blipFill>
+                    <a:blip r:embed="rId15"/>
+                    <a:stretch>
+                      <a:fillRect/>
+                    </a:stretch>
+                  </pic:blipFill>
+                  <pic:spPr>
+                    <a:xfrm>
+                      <a:off x="0" y="0"/>
+                      <a:ext cx="5486400" cy="3038475"/>
+                    </a:xfrm>
+                    <a:prstGeom prst="rect">
+                      <a:avLst/>
+                    </a:prstGeom>
+                  </pic:spPr>
+                </pic:pic>
+              </a:graphicData>
+            </a:graphic>
+          </wp:inline>
+        </w:drawing>
+      </w:r>
+    </w:p>
     <w:p>
       <w:pPr>
         <w:pStyle w:val="Heading3"/>
@@ -465,7 +808,50 @@
         <w:t>[Insert 4 KB Fault Rate chart here — include 10% reference line]</w:t>
       </w:r>
     </w:p>
-    <w:p/>
+    <w:p>
+      <w:r>
+        <w:rPr>
+          <w:noProof/>
+        </w:rPr>
+        <w:drawing>
+          <wp:inline distT="0" distB="0" distL="0" distR="0" wp14:anchorId="49379553" wp14:editId="57049FAA">
+            <wp:extent cx="5486400" cy="3038475"/>
+            <wp:effectExtent l="0" t="0" r="0" b="9525"/>
+            <wp:docPr id="8" name="Picture 1"/>
+            <wp:cNvGraphicFramePr>
+              <a:graphicFrameLocks xmlns:a="http://schemas.openxmlformats.org/drawingml/2006/main" noChangeAspect="1"/>
+            </wp:cNvGraphicFramePr>
+            <a:graphic xmlns:a="http://schemas.openxmlformats.org/drawingml/2006/main">
+              <a:graphicData uri="http://schemas.openxmlformats.org/drawingml/2006/picture">
+                <pic:pic xmlns:pic="http://schemas.openxmlformats.org/drawingml/2006/picture">
+                  <pic:nvPicPr>
+                    <pic:cNvPr id="8" name="Picture 8"/>
+                    <pic:cNvPicPr>
+                      <a:picLocks noChangeAspect="1"/>
+                    </pic:cNvPicPr>
+                  </pic:nvPicPr>
+                  <pic:blipFill>
+                    <a:blip r:embed="rId16"/>
+                    <a:stretch>
+                      <a:fillRect/>
+                    </a:stretch>
+                  </pic:blipFill>
+                  <pic:spPr>
+                    <a:xfrm>
+                      <a:off x="0" y="0"/>
+                      <a:ext cx="5486400" cy="3038475"/>
+                    </a:xfrm>
+                    <a:prstGeom prst="rect">
+                      <a:avLst/>
+                    </a:prstGeom>
+                  </pic:spPr>
+                </pic:pic>
+              </a:graphicData>
+            </a:graphic>
+          </wp:inline>
+        </w:drawing>
+      </w:r>
+    </w:p>
     <w:p>
       <w:pPr>
         <w:pStyle w:val="Heading1"/>
@@ -476,7 +862,11 @@
     </w:p>
     <w:p>
       <w:r>
-        <w:t>[Describe the shape of your fault-rate curves. Note the steep initial drop followed by flattening. Where does the inflection point occur for each frame size? What does the inflection point tell you about the process's working set size? Discuss any other interesting features you observe in the graphs.]</w:t>
+        <w:t xml:space="preserve">Each curve starts with a steep drop before flattening out at about the 10% threshold. As the process has more space to keep pages open in memory, the less loading and reloading occurs. The flattening and inflection point show the approximate working set size of the process, after </w:t>
+      </w:r>
+      <w:r>
+        <w:lastRenderedPageBreak/>
+        <w:t>which additional frames do not provide much benefit. This diminishing return visualizes how having more frames only provides so much more efficiency.</w:t>
       </w:r>
     </w:p>
     <w:p>
@@ -484,732 +874,15 @@
         <w:pStyle w:val="Heading1"/>
       </w:pPr>
       <w:r>
-        <w:lastRenderedPageBreak/>
         <w:t>6. Frame Size and Fault Rate Tradeoffs (5 pts)</w:t>
       </w:r>
     </w:p>
     <w:p>
       <w:r>
-        <w:t>[Discuss how larger frames reduce the number of distinct pages but increase internal fragmentation. Does your data support a preference for larger or smaller frames? What is the tradeoff between fewer faults (larger frames) and wasted memory (internal fragmentation)?]</w:t>
+        <w:t xml:space="preserve">Generally, larger frames reduce the number of page faults as each frame can hold more and more data, reducing the number of times switching occurs. In the data, larger frames can hit the 10% threshold faster as they can store more data from the working set. However, internal fragmentation becomes a greater issue as the frames get larger as unused space becomes an issue. </w:t>
       </w:r>
-    </w:p>
-    <w:p>
       <w:r>
-        <w:br w:type="page"/>
-      </w:r>
-    </w:p>
-    <w:p>
-      <w:pPr>
-        <w:pStyle w:val="Heading2"/>
-      </w:pPr>
-      <w:r>
-        <w:lastRenderedPageBreak/>
-        <w:t>Grading Rubric (delete this page before submitting)</w:t>
-      </w:r>
-    </w:p>
-    <w:p>
-      <w:pPr>
-        <w:pStyle w:val="Heading3"/>
-      </w:pPr>
-      <w:r>
-        <w:t>Point Breakdown (30 pts total)</w:t>
-      </w:r>
-    </w:p>
-    <w:tbl>
-      <w:tblPr>
-        <w:tblStyle w:val="LightGrid-Accent1"/>
-        <w:tblW w:w="0" w:type="auto"/>
-        <w:jc w:val="center"/>
-        <w:tblLook w:val="04A0" w:firstRow="1" w:lastRow="0" w:firstColumn="1" w:lastColumn="0" w:noHBand="0" w:noVBand="1"/>
-      </w:tblPr>
-      <w:tblGrid>
-        <w:gridCol w:w="4320"/>
-        <w:gridCol w:w="4320"/>
-      </w:tblGrid>
-      <w:tr>
-        <w:trPr>
-          <w:cnfStyle w:val="100000000000" w:firstRow="1" w:lastRow="0" w:firstColumn="0" w:lastColumn="0" w:oddVBand="0" w:evenVBand="0" w:oddHBand="0" w:evenHBand="0" w:firstRowFirstColumn="0" w:firstRowLastColumn="0" w:lastRowFirstColumn="0" w:lastRowLastColumn="0"/>
-          <w:jc w:val="center"/>
-        </w:trPr>
-        <w:tc>
-          <w:tcPr>
-            <w:cnfStyle w:val="001000000000" w:firstRow="0" w:lastRow="0" w:firstColumn="1" w:lastColumn="0" w:oddVBand="0" w:evenVBand="0" w:oddHBand="0" w:evenHBand="0" w:firstRowFirstColumn="0" w:firstRowLastColumn="0" w:lastRowFirstColumn="0" w:lastRowLastColumn="0"/>
-            <w:tcW w:w="4320" w:type="dxa"/>
-          </w:tcPr>
-          <w:p>
-            <w:r>
-              <w:t>Component</w:t>
-            </w:r>
-          </w:p>
-        </w:tc>
-        <w:tc>
-          <w:tcPr>
-            <w:tcW w:w="4320" w:type="dxa"/>
-          </w:tcPr>
-          <w:p>
-            <w:pPr>
-              <w:cnfStyle w:val="100000000000" w:firstRow="1" w:lastRow="0" w:firstColumn="0" w:lastColumn="0" w:oddVBand="0" w:evenVBand="0" w:oddHBand="0" w:evenHBand="0" w:firstRowFirstColumn="0" w:firstRowLastColumn="0" w:lastRowFirstColumn="0" w:lastRowLastColumn="0"/>
-            </w:pPr>
-            <w:r>
-              <w:t>Points</w:t>
-            </w:r>
-          </w:p>
-        </w:tc>
-      </w:tr>
-      <w:tr>
-        <w:trPr>
-          <w:cnfStyle w:val="000000100000" w:firstRow="0" w:lastRow="0" w:firstColumn="0" w:lastColumn="0" w:oddVBand="0" w:evenVBand="0" w:oddHBand="1" w:evenHBand="0" w:firstRowFirstColumn="0" w:firstRowLastColumn="0" w:lastRowFirstColumn="0" w:lastRowLastColumn="0"/>
-          <w:jc w:val="center"/>
-        </w:trPr>
-        <w:tc>
-          <w:tcPr>
-            <w:cnfStyle w:val="001000000000" w:firstRow="0" w:lastRow="0" w:firstColumn="1" w:lastColumn="0" w:oddVBand="0" w:evenVBand="0" w:oddHBand="0" w:evenHBand="0" w:firstRowFirstColumn="0" w:firstRowLastColumn="0" w:lastRowFirstColumn="0" w:lastRowLastColumn="0"/>
-            <w:tcW w:w="4320" w:type="dxa"/>
-          </w:tcPr>
-          <w:p>
-            <w:r>
-              <w:t>Optimum Frame Size Recommendation</w:t>
-            </w:r>
-          </w:p>
-        </w:tc>
-        <w:tc>
-          <w:tcPr>
-            <w:tcW w:w="4320" w:type="dxa"/>
-          </w:tcPr>
-          <w:p>
-            <w:pPr>
-              <w:cnfStyle w:val="000000100000" w:firstRow="0" w:lastRow="0" w:firstColumn="0" w:lastColumn="0" w:oddVBand="0" w:evenVBand="0" w:oddHBand="1" w:evenHBand="0" w:firstRowFirstColumn="0" w:firstRowLastColumn="0" w:lastRowFirstColumn="0" w:lastRowLastColumn="0"/>
-            </w:pPr>
-            <w:r>
-              <w:t>4</w:t>
-            </w:r>
-          </w:p>
-        </w:tc>
-      </w:tr>
-      <w:tr>
-        <w:trPr>
-          <w:cnfStyle w:val="000000010000" w:firstRow="0" w:lastRow="0" w:firstColumn="0" w:lastColumn="0" w:oddVBand="0" w:evenVBand="0" w:oddHBand="0" w:evenHBand="1" w:firstRowFirstColumn="0" w:firstRowLastColumn="0" w:lastRowFirstColumn="0" w:lastRowLastColumn="0"/>
-          <w:jc w:val="center"/>
-        </w:trPr>
-        <w:tc>
-          <w:tcPr>
-            <w:cnfStyle w:val="001000000000" w:firstRow="0" w:lastRow="0" w:firstColumn="1" w:lastColumn="0" w:oddVBand="0" w:evenVBand="0" w:oddHBand="0" w:evenHBand="0" w:firstRowFirstColumn="0" w:firstRowLastColumn="0" w:lastRowFirstColumn="0" w:lastRowLastColumn="0"/>
-            <w:tcW w:w="4320" w:type="dxa"/>
-          </w:tcPr>
-          <w:p>
-            <w:r>
-              <w:t>Frames for &lt; 10% Target Table</w:t>
-            </w:r>
-          </w:p>
-        </w:tc>
-        <w:tc>
-          <w:tcPr>
-            <w:tcW w:w="4320" w:type="dxa"/>
-          </w:tcPr>
-          <w:p>
-            <w:pPr>
-              <w:cnfStyle w:val="000000010000" w:firstRow="0" w:lastRow="0" w:firstColumn="0" w:lastColumn="0" w:oddVBand="0" w:evenVBand="0" w:oddHBand="0" w:evenHBand="1" w:firstRowFirstColumn="0" w:firstRowLastColumn="0" w:lastRowFirstColumn="0" w:lastRowLastColumn="0"/>
-            </w:pPr>
-            <w:r>
-              <w:t>4</w:t>
-            </w:r>
-          </w:p>
-        </w:tc>
-      </w:tr>
-      <w:tr>
-        <w:trPr>
-          <w:cnfStyle w:val="000000100000" w:firstRow="0" w:lastRow="0" w:firstColumn="0" w:lastColumn="0" w:oddVBand="0" w:evenVBand="0" w:oddHBand="1" w:evenHBand="0" w:firstRowFirstColumn="0" w:firstRowLastColumn="0" w:lastRowFirstColumn="0" w:lastRowLastColumn="0"/>
-          <w:jc w:val="center"/>
-        </w:trPr>
-        <w:tc>
-          <w:tcPr>
-            <w:cnfStyle w:val="001000000000" w:firstRow="0" w:lastRow="0" w:firstColumn="1" w:lastColumn="0" w:oddVBand="0" w:evenVBand="0" w:oddHBand="0" w:evenHBand="0" w:firstRowFirstColumn="0" w:firstRowLastColumn="0" w:lastRowFirstColumn="0" w:lastRowLastColumn="0"/>
-            <w:tcW w:w="4320" w:type="dxa"/>
-          </w:tcPr>
-          <w:p>
-            <w:r>
-              <w:t>Page Fault Charts (4 charts x 1.5 pts)</w:t>
-            </w:r>
-          </w:p>
-        </w:tc>
-        <w:tc>
-          <w:tcPr>
-            <w:tcW w:w="4320" w:type="dxa"/>
-          </w:tcPr>
-          <w:p>
-            <w:pPr>
-              <w:cnfStyle w:val="000000100000" w:firstRow="0" w:lastRow="0" w:firstColumn="0" w:lastColumn="0" w:oddVBand="0" w:evenVBand="0" w:oddHBand="1" w:evenHBand="0" w:firstRowFirstColumn="0" w:firstRowLastColumn="0" w:lastRowFirstColumn="0" w:lastRowLastColumn="0"/>
-            </w:pPr>
-            <w:r>
-              <w:t>6</w:t>
-            </w:r>
-          </w:p>
-        </w:tc>
-      </w:tr>
-      <w:tr>
-        <w:trPr>
-          <w:cnfStyle w:val="000000010000" w:firstRow="0" w:lastRow="0" w:firstColumn="0" w:lastColumn="0" w:oddVBand="0" w:evenVBand="0" w:oddHBand="0" w:evenHBand="1" w:firstRowFirstColumn="0" w:firstRowLastColumn="0" w:lastRowFirstColumn="0" w:lastRowLastColumn="0"/>
-          <w:jc w:val="center"/>
-        </w:trPr>
-        <w:tc>
-          <w:tcPr>
-            <w:cnfStyle w:val="001000000000" w:firstRow="0" w:lastRow="0" w:firstColumn="1" w:lastColumn="0" w:oddVBand="0" w:evenVBand="0" w:oddHBand="0" w:evenHBand="0" w:firstRowFirstColumn="0" w:firstRowLastColumn="0" w:lastRowFirstColumn="0" w:lastRowLastColumn="0"/>
-            <w:tcW w:w="4320" w:type="dxa"/>
-          </w:tcPr>
-          <w:p>
-            <w:r>
-              <w:t>Fault Rate Charts (4 charts x 1.5 pts)</w:t>
-            </w:r>
-          </w:p>
-        </w:tc>
-        <w:tc>
-          <w:tcPr>
-            <w:tcW w:w="4320" w:type="dxa"/>
-          </w:tcPr>
-          <w:p>
-            <w:pPr>
-              <w:cnfStyle w:val="000000010000" w:firstRow="0" w:lastRow="0" w:firstColumn="0" w:lastColumn="0" w:oddVBand="0" w:evenVBand="0" w:oddHBand="0" w:evenHBand="1" w:firstRowFirstColumn="0" w:firstRowLastColumn="0" w:lastRowFirstColumn="0" w:lastRowLastColumn="0"/>
-            </w:pPr>
-            <w:r>
-              <w:t>6</w:t>
-            </w:r>
-          </w:p>
-        </w:tc>
-      </w:tr>
-      <w:tr>
-        <w:trPr>
-          <w:cnfStyle w:val="000000100000" w:firstRow="0" w:lastRow="0" w:firstColumn="0" w:lastColumn="0" w:oddVBand="0" w:evenVBand="0" w:oddHBand="1" w:evenHBand="0" w:firstRowFirstColumn="0" w:firstRowLastColumn="0" w:lastRowFirstColumn="0" w:lastRowLastColumn="0"/>
-          <w:jc w:val="center"/>
-        </w:trPr>
-        <w:tc>
-          <w:tcPr>
-            <w:cnfStyle w:val="001000000000" w:firstRow="0" w:lastRow="0" w:firstColumn="1" w:lastColumn="0" w:oddVBand="0" w:evenVBand="0" w:oddHBand="0" w:evenHBand="0" w:firstRowFirstColumn="0" w:firstRowLastColumn="0" w:lastRowFirstColumn="0" w:lastRowLastColumn="0"/>
-            <w:tcW w:w="4320" w:type="dxa"/>
-          </w:tcPr>
-          <w:p>
-            <w:r>
-              <w:t>Curve Shape / Working Set Analysis</w:t>
-            </w:r>
-          </w:p>
-        </w:tc>
-        <w:tc>
-          <w:tcPr>
-            <w:tcW w:w="4320" w:type="dxa"/>
-          </w:tcPr>
-          <w:p>
-            <w:pPr>
-              <w:cnfStyle w:val="000000100000" w:firstRow="0" w:lastRow="0" w:firstColumn="0" w:lastColumn="0" w:oddVBand="0" w:evenVBand="0" w:oddHBand="1" w:evenHBand="0" w:firstRowFirstColumn="0" w:firstRowLastColumn="0" w:lastRowFirstColumn="0" w:lastRowLastColumn="0"/>
-            </w:pPr>
-            <w:r>
-              <w:t>5</w:t>
-            </w:r>
-          </w:p>
-        </w:tc>
-      </w:tr>
-      <w:tr>
-        <w:trPr>
-          <w:cnfStyle w:val="000000010000" w:firstRow="0" w:lastRow="0" w:firstColumn="0" w:lastColumn="0" w:oddVBand="0" w:evenVBand="0" w:oddHBand="0" w:evenHBand="1" w:firstRowFirstColumn="0" w:firstRowLastColumn="0" w:lastRowFirstColumn="0" w:lastRowLastColumn="0"/>
-          <w:jc w:val="center"/>
-        </w:trPr>
-        <w:tc>
-          <w:tcPr>
-            <w:cnfStyle w:val="001000000000" w:firstRow="0" w:lastRow="0" w:firstColumn="1" w:lastColumn="0" w:oddVBand="0" w:evenVBand="0" w:oddHBand="0" w:evenHBand="0" w:firstRowFirstColumn="0" w:firstRowLastColumn="0" w:lastRowFirstColumn="0" w:lastRowLastColumn="0"/>
-            <w:tcW w:w="4320" w:type="dxa"/>
-          </w:tcPr>
-          <w:p>
-            <w:r>
-              <w:t>Frame Size Tradeoffs</w:t>
-            </w:r>
-          </w:p>
-        </w:tc>
-        <w:tc>
-          <w:tcPr>
-            <w:tcW w:w="4320" w:type="dxa"/>
-          </w:tcPr>
-          <w:p>
-            <w:pPr>
-              <w:cnfStyle w:val="000000010000" w:firstRow="0" w:lastRow="0" w:firstColumn="0" w:lastColumn="0" w:oddVBand="0" w:evenVBand="0" w:oddHBand="0" w:evenHBand="1" w:firstRowFirstColumn="0" w:firstRowLastColumn="0" w:lastRowFirstColumn="0" w:lastRowLastColumn="0"/>
-            </w:pPr>
-            <w:r>
-              <w:t>5</w:t>
-            </w:r>
-          </w:p>
-        </w:tc>
-      </w:tr>
-      <w:tr>
-        <w:trPr>
-          <w:cnfStyle w:val="000000100000" w:firstRow="0" w:lastRow="0" w:firstColumn="0" w:lastColumn="0" w:oddVBand="0" w:evenVBand="0" w:oddHBand="1" w:evenHBand="0" w:firstRowFirstColumn="0" w:firstRowLastColumn="0" w:lastRowFirstColumn="0" w:lastRowLastColumn="0"/>
-          <w:jc w:val="center"/>
-        </w:trPr>
-        <w:tc>
-          <w:tcPr>
-            <w:cnfStyle w:val="001000000000" w:firstRow="0" w:lastRow="0" w:firstColumn="1" w:lastColumn="0" w:oddVBand="0" w:evenVBand="0" w:oddHBand="0" w:evenHBand="0" w:firstRowFirstColumn="0" w:firstRowLastColumn="0" w:lastRowFirstColumn="0" w:lastRowLastColumn="0"/>
-            <w:tcW w:w="4320" w:type="dxa"/>
-          </w:tcPr>
-          <w:p>
-            <w:r>
-              <w:t>TOTAL</w:t>
-            </w:r>
-          </w:p>
-        </w:tc>
-        <w:tc>
-          <w:tcPr>
-            <w:tcW w:w="4320" w:type="dxa"/>
-          </w:tcPr>
-          <w:p>
-            <w:pPr>
-              <w:cnfStyle w:val="000000100000" w:firstRow="0" w:lastRow="0" w:firstColumn="0" w:lastColumn="0" w:oddVBand="0" w:evenVBand="0" w:oddHBand="1" w:evenHBand="0" w:firstRowFirstColumn="0" w:firstRowLastColumn="0" w:lastRowFirstColumn="0" w:lastRowLastColumn="0"/>
-            </w:pPr>
-            <w:r>
-              <w:t>30</w:t>
-            </w:r>
-          </w:p>
-        </w:tc>
-      </w:tr>
-      <w:tr>
-        <w:trPr>
-          <w:cnfStyle w:val="000000010000" w:firstRow="0" w:lastRow="0" w:firstColumn="0" w:lastColumn="0" w:oddVBand="0" w:evenVBand="0" w:oddHBand="0" w:evenHBand="1" w:firstRowFirstColumn="0" w:firstRowLastColumn="0" w:lastRowFirstColumn="0" w:lastRowLastColumn="0"/>
-          <w:jc w:val="center"/>
-        </w:trPr>
-        <w:tc>
-          <w:tcPr>
-            <w:cnfStyle w:val="001000000000" w:firstRow="0" w:lastRow="0" w:firstColumn="1" w:lastColumn="0" w:oddVBand="0" w:evenVBand="0" w:oddHBand="0" w:evenHBand="0" w:firstRowFirstColumn="0" w:firstRowLastColumn="0" w:lastRowFirstColumn="0" w:lastRowLastColumn="0"/>
-            <w:tcW w:w="4320" w:type="dxa"/>
-          </w:tcPr>
-          <w:p/>
-        </w:tc>
-        <w:tc>
-          <w:tcPr>
-            <w:tcW w:w="4320" w:type="dxa"/>
-          </w:tcPr>
-          <w:p>
-            <w:pPr>
-              <w:cnfStyle w:val="000000010000" w:firstRow="0" w:lastRow="0" w:firstColumn="0" w:lastColumn="0" w:oddVBand="0" w:evenVBand="0" w:oddHBand="0" w:evenHBand="1" w:firstRowFirstColumn="0" w:firstRowLastColumn="0" w:lastRowFirstColumn="0" w:lastRowLastColumn="0"/>
-            </w:pPr>
-          </w:p>
-        </w:tc>
-      </w:tr>
-    </w:tbl>
-    <w:p/>
-    <w:p>
-      <w:pPr>
-        <w:pStyle w:val="Heading3"/>
-      </w:pPr>
-      <w:r>
-        <w:t>General Deductions (applied at grader discretion)</w:t>
-      </w:r>
-    </w:p>
-    <w:p>
-      <w:r>
-        <w:t>The following may result in point deductions from any section where the issue appears:</w:t>
-      </w:r>
-    </w:p>
-    <w:tbl>
-      <w:tblPr>
-        <w:tblStyle w:val="LightGrid-Accent1"/>
-        <w:tblW w:w="0" w:type="auto"/>
-        <w:jc w:val="center"/>
-        <w:tblLook w:val="04A0" w:firstRow="1" w:lastRow="0" w:firstColumn="1" w:lastColumn="0" w:noHBand="0" w:noVBand="1"/>
-      </w:tblPr>
-      <w:tblGrid>
-        <w:gridCol w:w="2880"/>
-        <w:gridCol w:w="2880"/>
-        <w:gridCol w:w="2880"/>
-      </w:tblGrid>
-      <w:tr>
-        <w:trPr>
-          <w:cnfStyle w:val="100000000000" w:firstRow="1" w:lastRow="0" w:firstColumn="0" w:lastColumn="0" w:oddVBand="0" w:evenVBand="0" w:oddHBand="0" w:evenHBand="0" w:firstRowFirstColumn="0" w:firstRowLastColumn="0" w:lastRowFirstColumn="0" w:lastRowLastColumn="0"/>
-          <w:jc w:val="center"/>
-        </w:trPr>
-        <w:tc>
-          <w:tcPr>
-            <w:cnfStyle w:val="001000000000" w:firstRow="0" w:lastRow="0" w:firstColumn="1" w:lastColumn="0" w:oddVBand="0" w:evenVBand="0" w:oddHBand="0" w:evenHBand="0" w:firstRowFirstColumn="0" w:firstRowLastColumn="0" w:lastRowFirstColumn="0" w:lastRowLastColumn="0"/>
-            <w:tcW w:w="2880" w:type="dxa"/>
-          </w:tcPr>
-          <w:p>
-            <w:r>
-              <w:t>Issue</w:t>
-            </w:r>
-          </w:p>
-        </w:tc>
-        <w:tc>
-          <w:tcPr>
-            <w:tcW w:w="2880" w:type="dxa"/>
-          </w:tcPr>
-          <w:p>
-            <w:pPr>
-              <w:cnfStyle w:val="100000000000" w:firstRow="1" w:lastRow="0" w:firstColumn="0" w:lastColumn="0" w:oddVBand="0" w:evenVBand="0" w:oddHBand="0" w:evenHBand="0" w:firstRowFirstColumn="0" w:firstRowLastColumn="0" w:lastRowFirstColumn="0" w:lastRowLastColumn="0"/>
-            </w:pPr>
-            <w:r>
-              <w:t>Deduction</w:t>
-            </w:r>
-          </w:p>
-        </w:tc>
-        <w:tc>
-          <w:tcPr>
-            <w:tcW w:w="2880" w:type="dxa"/>
-          </w:tcPr>
-          <w:p>
-            <w:pPr>
-              <w:cnfStyle w:val="100000000000" w:firstRow="1" w:lastRow="0" w:firstColumn="0" w:lastColumn="0" w:oddVBand="0" w:evenVBand="0" w:oddHBand="0" w:evenHBand="0" w:firstRowFirstColumn="0" w:firstRowLastColumn="0" w:lastRowFirstColumn="0" w:lastRowLastColumn="0"/>
-            </w:pPr>
-            <w:r>
-              <w:t>Description</w:t>
-            </w:r>
-          </w:p>
-        </w:tc>
-      </w:tr>
-      <w:tr>
-        <w:trPr>
-          <w:cnfStyle w:val="000000100000" w:firstRow="0" w:lastRow="0" w:firstColumn="0" w:lastColumn="0" w:oddVBand="0" w:evenVBand="0" w:oddHBand="1" w:evenHBand="0" w:firstRowFirstColumn="0" w:firstRowLastColumn="0" w:lastRowFirstColumn="0" w:lastRowLastColumn="0"/>
-          <w:jc w:val="center"/>
-        </w:trPr>
-        <w:tc>
-          <w:tcPr>
-            <w:cnfStyle w:val="001000000000" w:firstRow="0" w:lastRow="0" w:firstColumn="1" w:lastColumn="0" w:oddVBand="0" w:evenVBand="0" w:oddHBand="0" w:evenHBand="0" w:firstRowFirstColumn="0" w:firstRowLastColumn="0" w:lastRowFirstColumn="0" w:lastRowLastColumn="0"/>
-            <w:tcW w:w="2880" w:type="dxa"/>
-          </w:tcPr>
-          <w:p>
-            <w:r>
-              <w:t>Insufficient technical depth</w:t>
-            </w:r>
-          </w:p>
-        </w:tc>
-        <w:tc>
-          <w:tcPr>
-            <w:tcW w:w="2880" w:type="dxa"/>
-          </w:tcPr>
-          <w:p>
-            <w:pPr>
-              <w:cnfStyle w:val="000000100000" w:firstRow="0" w:lastRow="0" w:firstColumn="0" w:lastColumn="0" w:oddVBand="0" w:evenVBand="0" w:oddHBand="1" w:evenHBand="0" w:firstRowFirstColumn="0" w:firstRowLastColumn="0" w:lastRowFirstColumn="0" w:lastRowLastColumn="0"/>
-            </w:pPr>
-            <w:r>
-              <w:t>up to -3 pts</w:t>
-            </w:r>
-          </w:p>
-        </w:tc>
-        <w:tc>
-          <w:tcPr>
-            <w:tcW w:w="2880" w:type="dxa"/>
-          </w:tcPr>
-          <w:p>
-            <w:pPr>
-              <w:cnfStyle w:val="000000100000" w:firstRow="0" w:lastRow="0" w:firstColumn="0" w:lastColumn="0" w:oddVBand="0" w:evenVBand="0" w:oddHBand="1" w:evenHBand="0" w:firstRowFirstColumn="0" w:firstRowLastColumn="0" w:lastRowFirstColumn="0" w:lastRowLastColumn="0"/>
-            </w:pPr>
-            <w:r>
-              <w:t>Analysis should reflect understanding of virtual memory, page replacement, and working set concepts — not just restate numbers from the data.</w:t>
-            </w:r>
-          </w:p>
-        </w:tc>
-      </w:tr>
-      <w:tr>
-        <w:trPr>
-          <w:cnfStyle w:val="000000010000" w:firstRow="0" w:lastRow="0" w:firstColumn="0" w:lastColumn="0" w:oddVBand="0" w:evenVBand="0" w:oddHBand="0" w:evenHBand="1" w:firstRowFirstColumn="0" w:firstRowLastColumn="0" w:lastRowFirstColumn="0" w:lastRowLastColumn="0"/>
-          <w:jc w:val="center"/>
-        </w:trPr>
-        <w:tc>
-          <w:tcPr>
-            <w:cnfStyle w:val="001000000000" w:firstRow="0" w:lastRow="0" w:firstColumn="1" w:lastColumn="0" w:oddVBand="0" w:evenVBand="0" w:oddHBand="0" w:evenHBand="0" w:firstRowFirstColumn="0" w:firstRowLastColumn="0" w:lastRowFirstColumn="0" w:lastRowLastColumn="0"/>
-            <w:tcW w:w="2880" w:type="dxa"/>
-          </w:tcPr>
-          <w:p>
-            <w:r>
-              <w:t>Unprofessional presentation</w:t>
-            </w:r>
-          </w:p>
-        </w:tc>
-        <w:tc>
-          <w:tcPr>
-            <w:tcW w:w="2880" w:type="dxa"/>
-          </w:tcPr>
-          <w:p>
-            <w:pPr>
-              <w:cnfStyle w:val="000000010000" w:firstRow="0" w:lastRow="0" w:firstColumn="0" w:lastColumn="0" w:oddVBand="0" w:evenVBand="0" w:oddHBand="0" w:evenHBand="1" w:firstRowFirstColumn="0" w:firstRowLastColumn="0" w:lastRowFirstColumn="0" w:lastRowLastColumn="0"/>
-            </w:pPr>
-            <w:r>
-              <w:t>up to -3 pts</w:t>
-            </w:r>
-          </w:p>
-        </w:tc>
-        <w:tc>
-          <w:tcPr>
-            <w:tcW w:w="2880" w:type="dxa"/>
-          </w:tcPr>
-          <w:p>
-            <w:pPr>
-              <w:cnfStyle w:val="000000010000" w:firstRow="0" w:lastRow="0" w:firstColumn="0" w:lastColumn="0" w:oddVBand="0" w:evenVBand="0" w:oddHBand="0" w:evenHBand="1" w:firstRowFirstColumn="0" w:firstRowLastColumn="0" w:lastRowFirstColumn="0" w:lastRowLastColumn="0"/>
-            </w:pPr>
-            <w:r>
-              <w:t>The report should read as a polished technical document suitable for a professional audience. Sloppy formatting, missing chart labels, or inconsistent style will result in deductions.</w:t>
-            </w:r>
-          </w:p>
-        </w:tc>
-      </w:tr>
-      <w:tr>
-        <w:trPr>
-          <w:cnfStyle w:val="000000100000" w:firstRow="0" w:lastRow="0" w:firstColumn="0" w:lastColumn="0" w:oddVBand="0" w:evenVBand="0" w:oddHBand="1" w:evenHBand="0" w:firstRowFirstColumn="0" w:firstRowLastColumn="0" w:lastRowFirstColumn="0" w:lastRowLastColumn="0"/>
-          <w:jc w:val="center"/>
-        </w:trPr>
-        <w:tc>
-          <w:tcPr>
-            <w:cnfStyle w:val="001000000000" w:firstRow="0" w:lastRow="0" w:firstColumn="1" w:lastColumn="0" w:oddVBand="0" w:evenVBand="0" w:oddHBand="0" w:evenHBand="0" w:firstRowFirstColumn="0" w:firstRowLastColumn="0" w:lastRowFirstColumn="0" w:lastRowLastColumn="0"/>
-            <w:tcW w:w="2880" w:type="dxa"/>
-          </w:tcPr>
-          <w:p>
-            <w:r>
-              <w:t>Spelling and grammar errors</w:t>
-            </w:r>
-          </w:p>
-        </w:tc>
-        <w:tc>
-          <w:tcPr>
-            <w:tcW w:w="2880" w:type="dxa"/>
-          </w:tcPr>
-          <w:p>
-            <w:pPr>
-              <w:cnfStyle w:val="000000100000" w:firstRow="0" w:lastRow="0" w:firstColumn="0" w:lastColumn="0" w:oddVBand="0" w:evenVBand="0" w:oddHBand="1" w:evenHBand="0" w:firstRowFirstColumn="0" w:firstRowLastColumn="0" w:lastRowFirstColumn="0" w:lastRowLastColumn="0"/>
-            </w:pPr>
-            <w:r>
-              <w:t>up to -2 pts</w:t>
-            </w:r>
-          </w:p>
-        </w:tc>
-        <w:tc>
-          <w:tcPr>
-            <w:tcW w:w="2880" w:type="dxa"/>
-          </w:tcPr>
-          <w:p>
-            <w:pPr>
-              <w:cnfStyle w:val="000000100000" w:firstRow="0" w:lastRow="0" w:firstColumn="0" w:lastColumn="0" w:oddVBand="0" w:evenVBand="0" w:oddHBand="1" w:evenHBand="0" w:firstRowFirstColumn="0" w:firstRowLastColumn="0" w:lastRowFirstColumn="0" w:lastRowLastColumn="0"/>
-            </w:pPr>
-            <w:r>
-              <w:t>Proofread carefully. Use a spell checker. Technical writing demands precision in language as well as content.</w:t>
-            </w:r>
-          </w:p>
-        </w:tc>
-      </w:tr>
-      <w:tr>
-        <w:trPr>
-          <w:cnfStyle w:val="000000010000" w:firstRow="0" w:lastRow="0" w:firstColumn="0" w:lastColumn="0" w:oddVBand="0" w:evenVBand="0" w:oddHBand="0" w:evenHBand="1" w:firstRowFirstColumn="0" w:firstRowLastColumn="0" w:lastRowFirstColumn="0" w:lastRowLastColumn="0"/>
-          <w:jc w:val="center"/>
-        </w:trPr>
-        <w:tc>
-          <w:tcPr>
-            <w:cnfStyle w:val="001000000000" w:firstRow="0" w:lastRow="0" w:firstColumn="1" w:lastColumn="0" w:oddVBand="0" w:evenVBand="0" w:oddHBand="0" w:evenHBand="0" w:firstRowFirstColumn="0" w:firstRowLastColumn="0" w:lastRowFirstColumn="0" w:lastRowLastColumn="0"/>
-            <w:tcW w:w="2880" w:type="dxa"/>
-          </w:tcPr>
-          <w:p>
-            <w:r>
-              <w:t>Use of first person</w:t>
-            </w:r>
-          </w:p>
-        </w:tc>
-        <w:tc>
-          <w:tcPr>
-            <w:tcW w:w="2880" w:type="dxa"/>
-          </w:tcPr>
-          <w:p>
-            <w:pPr>
-              <w:cnfStyle w:val="000000010000" w:firstRow="0" w:lastRow="0" w:firstColumn="0" w:lastColumn="0" w:oddVBand="0" w:evenVBand="0" w:oddHBand="0" w:evenHBand="1" w:firstRowFirstColumn="0" w:firstRowLastColumn="0" w:lastRowFirstColumn="0" w:lastRowLastColumn="0"/>
-            </w:pPr>
-            <w:r>
-              <w:t>up to -2 pts</w:t>
-            </w:r>
-          </w:p>
-        </w:tc>
-        <w:tc>
-          <w:tcPr>
-            <w:tcW w:w="2880" w:type="dxa"/>
-          </w:tcPr>
-          <w:p>
-            <w:pPr>
-              <w:cnfStyle w:val="000000010000" w:firstRow="0" w:lastRow="0" w:firstColumn="0" w:lastColumn="0" w:oddVBand="0" w:evenVBand="0" w:oddHBand="0" w:evenHBand="1" w:firstRowFirstColumn="0" w:firstRowLastColumn="0" w:lastRowFirstColumn="0" w:lastRowLastColumn="0"/>
-            </w:pPr>
-            <w:r>
-              <w:t>Do not use "I," "we," "my," or "our." Write from an objective, third-person perspective throughout.</w:t>
-            </w:r>
-          </w:p>
-        </w:tc>
-      </w:tr>
-      <w:tr>
-        <w:trPr>
-          <w:cnfStyle w:val="000000100000" w:firstRow="0" w:lastRow="0" w:firstColumn="0" w:lastColumn="0" w:oddVBand="0" w:evenVBand="0" w:oddHBand="1" w:evenHBand="0" w:firstRowFirstColumn="0" w:firstRowLastColumn="0" w:lastRowFirstColumn="0" w:lastRowLastColumn="0"/>
-          <w:jc w:val="center"/>
-        </w:trPr>
-        <w:tc>
-          <w:tcPr>
-            <w:cnfStyle w:val="001000000000" w:firstRow="0" w:lastRow="0" w:firstColumn="1" w:lastColumn="0" w:oddVBand="0" w:evenVBand="0" w:oddHBand="0" w:evenHBand="0" w:firstRowFirstColumn="0" w:firstRowLastColumn="0" w:lastRowFirstColumn="0" w:lastRowLastColumn="0"/>
-            <w:tcW w:w="2880" w:type="dxa"/>
-          </w:tcPr>
-          <w:p>
-            <w:r>
-              <w:t>Passive voice</w:t>
-            </w:r>
-          </w:p>
-        </w:tc>
-        <w:tc>
-          <w:tcPr>
-            <w:tcW w:w="2880" w:type="dxa"/>
-          </w:tcPr>
-          <w:p>
-            <w:pPr>
-              <w:cnfStyle w:val="000000100000" w:firstRow="0" w:lastRow="0" w:firstColumn="0" w:lastColumn="0" w:oddVBand="0" w:evenVBand="0" w:oddHBand="1" w:evenHBand="0" w:firstRowFirstColumn="0" w:firstRowLastColumn="0" w:lastRowFirstColumn="0" w:lastRowLastColumn="0"/>
-            </w:pPr>
-            <w:r>
-              <w:t>up to -1 pt</w:t>
-            </w:r>
-          </w:p>
-        </w:tc>
-        <w:tc>
-          <w:tcPr>
-            <w:tcW w:w="2880" w:type="dxa"/>
-          </w:tcPr>
-          <w:p>
-            <w:pPr>
-              <w:cnfStyle w:val="000000100000" w:firstRow="0" w:lastRow="0" w:firstColumn="0" w:lastColumn="0" w:oddVBand="0" w:evenVBand="0" w:oddHBand="1" w:evenHBand="0" w:firstRowFirstColumn="0" w:firstRowLastColumn="0" w:lastRowFirstColumn="0" w:lastRowLastColumn="0"/>
-            </w:pPr>
-            <w:r>
-              <w:t xml:space="preserve">Use active voice. Write "LRU </w:t>
-            </w:r>
-            <w:r>
-              <w:lastRenderedPageBreak/>
-              <w:t>reduces the fault rate" rather than "The fault rate is reduced by LRU."</w:t>
-            </w:r>
-          </w:p>
-        </w:tc>
-      </w:tr>
-      <w:tr>
-        <w:trPr>
-          <w:cnfStyle w:val="000000010000" w:firstRow="0" w:lastRow="0" w:firstColumn="0" w:lastColumn="0" w:oddVBand="0" w:evenVBand="0" w:oddHBand="0" w:evenHBand="1" w:firstRowFirstColumn="0" w:firstRowLastColumn="0" w:lastRowFirstColumn="0" w:lastRowLastColumn="0"/>
-          <w:jc w:val="center"/>
-        </w:trPr>
-        <w:tc>
-          <w:tcPr>
-            <w:cnfStyle w:val="001000000000" w:firstRow="0" w:lastRow="0" w:firstColumn="1" w:lastColumn="0" w:oddVBand="0" w:evenVBand="0" w:oddHBand="0" w:evenHBand="0" w:firstRowFirstColumn="0" w:firstRowLastColumn="0" w:lastRowFirstColumn="0" w:lastRowLastColumn="0"/>
-            <w:tcW w:w="2880" w:type="dxa"/>
-          </w:tcPr>
-          <w:p>
-            <w:r>
-              <w:lastRenderedPageBreak/>
-              <w:t>Verbose or unclear writing</w:t>
-            </w:r>
-          </w:p>
-        </w:tc>
-        <w:tc>
-          <w:tcPr>
-            <w:tcW w:w="2880" w:type="dxa"/>
-          </w:tcPr>
-          <w:p>
-            <w:pPr>
-              <w:cnfStyle w:val="000000010000" w:firstRow="0" w:lastRow="0" w:firstColumn="0" w:lastColumn="0" w:oddVBand="0" w:evenVBand="0" w:oddHBand="0" w:evenHBand="1" w:firstRowFirstColumn="0" w:firstRowLastColumn="0" w:lastRowFirstColumn="0" w:lastRowLastColumn="0"/>
-            </w:pPr>
-            <w:r>
-              <w:t>up to -2 pts</w:t>
-            </w:r>
-          </w:p>
-        </w:tc>
-        <w:tc>
-          <w:tcPr>
-            <w:tcW w:w="2880" w:type="dxa"/>
-          </w:tcPr>
-          <w:p>
-            <w:pPr>
-              <w:cnfStyle w:val="000000010000" w:firstRow="0" w:lastRow="0" w:firstColumn="0" w:lastColumn="0" w:oddVBand="0" w:evenVBand="0" w:oddHBand="0" w:evenHBand="1" w:firstRowFirstColumn="0" w:firstRowLastColumn="0" w:lastRowFirstColumn="0" w:lastRowLastColumn="0"/>
-            </w:pPr>
-            <w:r>
-              <w:t>Be direct and concise. Every sentence should contribute meaningful analysis. Avoid filler, redundancy, and vague statements such as "the results were interesting."</w:t>
-            </w:r>
-          </w:p>
-        </w:tc>
-      </w:tr>
-    </w:tbl>
-    <w:p/>
-    <w:p>
-      <w:pPr>
-        <w:pStyle w:val="Heading3"/>
-      </w:pPr>
-      <w:r>
-        <w:t>Submission Checklist</w:t>
-      </w:r>
-    </w:p>
-    <w:p>
-      <w:pPr>
-        <w:pStyle w:val="ListBullet"/>
-      </w:pPr>
-      <w:r>
-        <w:t>All 8 charts embedded directly in the document (not linked)</w:t>
-      </w:r>
-    </w:p>
-    <w:p>
-      <w:pPr>
-        <w:pStyle w:val="ListBullet"/>
-      </w:pPr>
-      <w:r>
-        <w:t>Each chart has a descriptive title (e.g., "Page-Fault Rate vs. Frames — 4KB")</w:t>
-      </w:r>
-    </w:p>
-    <w:p>
-      <w:pPr>
-        <w:pStyle w:val="ListBullet"/>
-      </w:pPr>
-      <w:r>
-        <w:t>Axes labeled with units on every chart</w:t>
-      </w:r>
-    </w:p>
-    <w:p>
-      <w:pPr>
-        <w:pStyle w:val="ListBullet"/>
-      </w:pPr>
-      <w:r>
-        <w:t>10% reference line on all 4 fault-rate charts</w:t>
-      </w:r>
-    </w:p>
-    <w:p>
-      <w:pPr>
-        <w:pStyle w:val="ListBullet"/>
-      </w:pPr>
-      <w:r>
-        <w:t>Minimum 250 words of written analysis</w:t>
-      </w:r>
-    </w:p>
-    <w:p>
-      <w:pPr>
-        <w:pStyle w:val="ListBullet"/>
-      </w:pPr>
-      <w:r>
-        <w:t>No first person; active voice; concise language</w:t>
-      </w:r>
-    </w:p>
-    <w:p>
-      <w:pPr>
-        <w:pStyle w:val="ListBullet"/>
-      </w:pPr>
-      <w:r>
-        <w:t>No spelling or grammar errors</w:t>
-      </w:r>
-    </w:p>
-    <w:p>
-      <w:pPr>
-        <w:pStyle w:val="ListBullet"/>
-      </w:pPr>
-      <w:r>
-        <w:t>Report stands alone — readable without consulting CSV files</w:t>
-      </w:r>
-    </w:p>
-    <w:p>
-      <w:pPr>
-        <w:pStyle w:val="ListBullet"/>
-      </w:pPr>
-      <w:r>
-        <w:t>Documentation statement completed in both main.c and this report</w:t>
-      </w:r>
-    </w:p>
-    <w:p>
-      <w:pPr>
-        <w:pStyle w:val="ListBullet"/>
-      </w:pPr>
-      <w:r>
-        <w:t>File saved as .docx and committed to GitHub repo</w:t>
+        <w:t xml:space="preserve">This is less of a problem with smaller frames as they tend to be more full, but the trade off becomes sheer number of frames. This data supports a preference for a middle ground of a 1KB frame which shows that the optimal solution is neither the largest or smallest frame. </w:t>
       </w:r>
     </w:p>
     <w:sectPr>
@@ -13126,32 +12799,6 @@
 </file>
 
 <file path=customXml/item1.xml><?xml version="1.0" encoding="utf-8"?>
-<b:Sources xmlns:b="http://schemas.openxmlformats.org/officeDocument/2006/bibliography" xmlns="http://schemas.openxmlformats.org/officeDocument/2006/bibliography" SelectedStyle="/APA.XSL" StyleName="APA"/>
-</file>
-
-<file path=customXml/item2.xml><?xml version="1.0" encoding="utf-8"?>
-<p:properties xmlns:p="http://schemas.microsoft.com/office/2006/metadata/properties" xmlns:xsi="http://www.w3.org/2001/XMLSchema-instance" xmlns:pc="http://schemas.microsoft.com/office/infopath/2007/PartnerControls">
-  <documentManagement>
-    <_ip_UnifiedCompliancePolicyUIAction xmlns="http://schemas.microsoft.com/sharepoint/v3" xsi:nil="true"/>
-    <TaxCatchAll xmlns="56f87f42-bac6-49e2-b9d5-04744cb514ee" xsi:nil="true"/>
-    <lcf76f155ced4ddcb4097134ff3c332f xmlns="fcae3b96-bd14-4ee2-8386-a94084e60018">
-      <Terms xmlns="http://schemas.microsoft.com/office/infopath/2007/PartnerControls"/>
-    </lcf76f155ced4ddcb4097134ff3c332f>
-    <_ip_UnifiedCompliancePolicyProperties xmlns="http://schemas.microsoft.com/sharepoint/v3" xsi:nil="true"/>
-  </documentManagement>
-</p:properties>
-</file>
-
-<file path=customXml/item3.xml><?xml version="1.0" encoding="utf-8"?>
-<?mso-contentType ?>
-<FormTemplates xmlns="http://schemas.microsoft.com/sharepoint/v3/contenttype/forms">
-  <Display>DocumentLibraryForm</Display>
-  <Edit>DocumentLibraryForm</Edit>
-  <New>DocumentLibraryForm</New>
-</FormTemplates>
-</file>
-
-<file path=customXml/item4.xml><?xml version="1.0" encoding="utf-8"?>
 <ct:contentTypeSchema xmlns:ct="http://schemas.microsoft.com/office/2006/metadata/contentType" xmlns:ma="http://schemas.microsoft.com/office/2006/metadata/properties/metaAttributes" ct:_="" ma:_="" ma:contentTypeName="Document" ma:contentTypeID="0x0101006A7D154A9B6B4745A92074A700A40869" ma:contentTypeVersion="24" ma:contentTypeDescription="Create a new document." ma:contentTypeScope="" ma:versionID="49c36a49e684e25092aa685b0fe35842">
   <xsd:schema xmlns:xsd="http://www.w3.org/2001/XMLSchema" xmlns:xs="http://www.w3.org/2001/XMLSchema" xmlns:p="http://schemas.microsoft.com/office/2006/metadata/properties" xmlns:ns1="http://schemas.microsoft.com/sharepoint/v3" xmlns:ns2="fcae3b96-bd14-4ee2-8386-a94084e60018" xmlns:ns3="56f87f42-bac6-49e2-b9d5-04744cb514ee" targetNamespace="http://schemas.microsoft.com/office/2006/metadata/properties" ma:root="true" ma:fieldsID="9c960b9d532a5d3a9032170b89435a2d" ns1:_="" ns2:_="" ns3:_="">
     <xsd:import namespace="http://schemas.microsoft.com/sharepoint/v3"/>
@@ -13429,35 +13076,33 @@
 </ct:contentTypeSchema>
 </file>
 
-<file path=customXml/itemProps1.xml><?xml version="1.0" encoding="utf-8"?>
-<ds:datastoreItem xmlns:ds="http://schemas.openxmlformats.org/officeDocument/2006/customXml" ds:itemID="{EF278816-EC6F-A645-907D-7F25AECB1D4A}">
-  <ds:schemaRefs>
-    <ds:schemaRef ds:uri="http://schemas.openxmlformats.org/officeDocument/2006/bibliography"/>
-  </ds:schemaRefs>
-</ds:datastoreItem>
+<file path=customXml/item2.xml><?xml version="1.0" encoding="utf-8"?>
+<?mso-contentType ?>
+<FormTemplates xmlns="http://schemas.microsoft.com/sharepoint/v3/contenttype/forms">
+  <Display>DocumentLibraryForm</Display>
+  <Edit>DocumentLibraryForm</Edit>
+  <New>DocumentLibraryForm</New>
+</FormTemplates>
 </file>
 
-<file path=customXml/itemProps2.xml><?xml version="1.0" encoding="utf-8"?>
-<ds:datastoreItem xmlns:ds="http://schemas.openxmlformats.org/officeDocument/2006/customXml" ds:itemID="{94EDD69F-103F-4891-A1A7-DE0F9F4E28FD}">
-  <ds:schemaRefs>
-    <ds:schemaRef ds:uri="http://schemas.microsoft.com/office/2006/metadata/properties"/>
-    <ds:schemaRef ds:uri="http://schemas.microsoft.com/office/infopath/2007/PartnerControls"/>
-    <ds:schemaRef ds:uri="http://schemas.microsoft.com/sharepoint/v3"/>
-    <ds:schemaRef ds:uri="56f87f42-bac6-49e2-b9d5-04744cb514ee"/>
-    <ds:schemaRef ds:uri="fcae3b96-bd14-4ee2-8386-a94084e60018"/>
-  </ds:schemaRefs>
-</ds:datastoreItem>
+<file path=customXml/item3.xml><?xml version="1.0" encoding="utf-8"?>
+<p:properties xmlns:p="http://schemas.microsoft.com/office/2006/metadata/properties" xmlns:xsi="http://www.w3.org/2001/XMLSchema-instance" xmlns:pc="http://schemas.microsoft.com/office/infopath/2007/PartnerControls">
+  <documentManagement>
+    <_ip_UnifiedCompliancePolicyUIAction xmlns="http://schemas.microsoft.com/sharepoint/v3" xsi:nil="true"/>
+    <TaxCatchAll xmlns="56f87f42-bac6-49e2-b9d5-04744cb514ee" xsi:nil="true"/>
+    <lcf76f155ced4ddcb4097134ff3c332f xmlns="fcae3b96-bd14-4ee2-8386-a94084e60018">
+      <Terms xmlns="http://schemas.microsoft.com/office/infopath/2007/PartnerControls"/>
+    </lcf76f155ced4ddcb4097134ff3c332f>
+    <_ip_UnifiedCompliancePolicyProperties xmlns="http://schemas.microsoft.com/sharepoint/v3" xsi:nil="true"/>
+  </documentManagement>
+</p:properties>
 </file>
 
-<file path=customXml/itemProps3.xml><?xml version="1.0" encoding="utf-8"?>
-<ds:datastoreItem xmlns:ds="http://schemas.openxmlformats.org/officeDocument/2006/customXml" ds:itemID="{CEDA4C41-BA4A-4F0B-A87E-F30AA6591D91}">
-  <ds:schemaRefs>
-    <ds:schemaRef ds:uri="http://schemas.microsoft.com/sharepoint/v3/contenttype/forms"/>
-  </ds:schemaRefs>
-</ds:datastoreItem>
+<file path=customXml/item4.xml><?xml version="1.0" encoding="utf-8"?>
+<b:Sources xmlns:b="http://schemas.openxmlformats.org/officeDocument/2006/bibliography" xmlns="http://schemas.openxmlformats.org/officeDocument/2006/bibliography" SelectedStyle="/APA.XSL" StyleName="APA"/>
 </file>
 
-<file path=customXml/itemProps4.xml><?xml version="1.0" encoding="utf-8"?>
+<file path=customXml/itemProps1.xml><?xml version="1.0" encoding="utf-8"?>
 <ds:datastoreItem xmlns:ds="http://schemas.openxmlformats.org/officeDocument/2006/customXml" ds:itemID="{131969F9-69E6-4531-89F9-CCA743737436}">
   <ds:schemaRefs>
     <ds:schemaRef ds:uri="http://schemas.microsoft.com/office/2006/metadata/contentType"/>
@@ -13477,6 +13122,34 @@
 </ds:datastoreItem>
 </file>
 
+<file path=customXml/itemProps2.xml><?xml version="1.0" encoding="utf-8"?>
+<ds:datastoreItem xmlns:ds="http://schemas.openxmlformats.org/officeDocument/2006/customXml" ds:itemID="{CEDA4C41-BA4A-4F0B-A87E-F30AA6591D91}">
+  <ds:schemaRefs>
+    <ds:schemaRef ds:uri="http://schemas.microsoft.com/sharepoint/v3/contenttype/forms"/>
+  </ds:schemaRefs>
+</ds:datastoreItem>
+</file>
+
+<file path=customXml/itemProps3.xml><?xml version="1.0" encoding="utf-8"?>
+<ds:datastoreItem xmlns:ds="http://schemas.openxmlformats.org/officeDocument/2006/customXml" ds:itemID="{94EDD69F-103F-4891-A1A7-DE0F9F4E28FD}">
+  <ds:schemaRefs>
+    <ds:schemaRef ds:uri="http://schemas.microsoft.com/office/2006/metadata/properties"/>
+    <ds:schemaRef ds:uri="http://schemas.microsoft.com/office/infopath/2007/PartnerControls"/>
+    <ds:schemaRef ds:uri="http://schemas.microsoft.com/sharepoint/v3"/>
+    <ds:schemaRef ds:uri="56f87f42-bac6-49e2-b9d5-04744cb514ee"/>
+    <ds:schemaRef ds:uri="fcae3b96-bd14-4ee2-8386-a94084e60018"/>
+  </ds:schemaRefs>
+</ds:datastoreItem>
+</file>
+
+<file path=customXml/itemProps4.xml><?xml version="1.0" encoding="utf-8"?>
+<ds:datastoreItem xmlns:ds="http://schemas.openxmlformats.org/officeDocument/2006/customXml" ds:itemID="{EF278816-EC6F-A645-907D-7F25AECB1D4A}">
+  <ds:schemaRefs>
+    <ds:schemaRef ds:uri="http://schemas.openxmlformats.org/officeDocument/2006/bibliography"/>
+  </ds:schemaRefs>
+</ds:datastoreItem>
+</file>
+
 <file path=docMetadata/LabelInfo.xml><?xml version="1.0" encoding="utf-8"?>
 <clbl:labelList xmlns:clbl="http://schemas.microsoft.com/office/2020/mipLabelMetadata">
   <clbl:label id="{7ab80a06-f029-45c0-84d1-7dad19ce3c61}" enabled="0" method="" siteId="{7ab80a06-f029-45c0-84d1-7dad19ce3c61}" removed="1"/>

</xml_diff>